<commit_message>
Update dynamic code documentation files with latest changes across multiple documents, including automation orchestrator, install monitor, physical server build, and various test and update documents.
</commit_message>
<xml_diff>
--- a/docx/Automation/automation_commands.docx
+++ b/docx/Automation/automation_commands.docx
@@ -2,7 +2,7 @@
 <file path=word/document.xml><?xml version="1.0" encoding="utf-8"?>
 <w:document xmlns:w="http://schemas.openxmlformats.org/wordprocessingml/2006/main" xmlns:m="http://schemas.openxmlformats.org/officeDocument/2006/math" xmlns:r="http://schemas.openxmlformats.org/officeDocument/2006/relationships" xmlns:o="urn:schemas-microsoft-com:office:office" xmlns:v="urn:schemas-microsoft-com:vml" xmlns:w10="urn:schemas-microsoft-com:office:word" xmlns:a="http://schemas.openxmlformats.org/drawingml/2006/main" xmlns:pic="http://schemas.openxmlformats.org/drawingml/2006/picture" xmlns:wp="http://schemas.openxmlformats.org/drawingml/2006/wordprocessingDrawing">
   <w:body>
-    <w:bookmarkStart w:id="86" w:name="sec1"/>
+    <w:bookmarkStart w:id="87" w:name="sec1"/>
     <w:p>
       <w:pPr>
         <w:pStyle w:val="Heading1"/>
@@ -2225,7 +2225,7 @@
         <w:t xml:space="preserve">-Deploy</w:t>
       </w:r>
       <w:r>
-        <w:t xml:space="preserve">), it internally executes the build pipeline — OneView resolution, maintenance mode enable, iLO mount, OS install, post-build validation, and maintenance mode disable.</w:t>
+        <w:t xml:space="preserve">), it internally executes the build pipeline — OneView resolution, maintenance mode enable (if not already enabled), iLO mount, OS install, post-build validation. Maintenance mode disable is a manual operator action after the build.</w:t>
       </w:r>
     </w:p>
     <w:p>
@@ -2633,7 +2633,7 @@
               <w:t xml:space="preserve"> </w:t>
             </w:r>
             <w:r>
-              <w:t xml:space="preserve">internally — OneView resolution, maintenance mode enable, ISO mount + reboot (wipe/reinstall), post-build validation, and maintenance mode disable. Gated by</w:t>
+              <w:t xml:space="preserve">internally — OneView resolution, maintenance mode enable (if not already enabled), ISO mount + reboot (wipe/reinstall), post-build validation. Gated by</w:t>
             </w:r>
             <w:r>
               <w:t xml:space="preserve"> </w:t>
@@ -2691,7 +2691,7 @@
               <w:t xml:space="preserve"> </w:t>
             </w:r>
             <w:r>
-              <w:t xml:space="preserve">to skip).</w:t>
+              <w:t xml:space="preserve">to skip). Maintenance mode disable is a manual operator action after the build completes.</w:t>
             </w:r>
           </w:p>
         </w:tc>
@@ -12177,7 +12177,7 @@
     </w:p>
     <w:bookmarkEnd w:id="26"/>
     <w:bookmarkEnd w:id="27"/>
-    <w:bookmarkStart w:id="36" w:name="sec50"/>
+    <w:bookmarkStart w:id="37" w:name="sec50"/>
     <w:p>
       <w:pPr>
         <w:pStyle w:val="Heading2"/>
@@ -13103,7 +13103,46 @@
               <w:pStyle w:val="Compact"/>
             </w:pPr>
             <w:r>
-              <w:t xml:space="preserve">PSCredential for iLO Redfish check (prompted if omitted).</w:t>
+              <w:rPr>
+                <w:rStyle w:val="VerbatimChar"/>
+              </w:rPr>
+              <w:t xml:space="preserve">PSCredential</w:t>
+            </w:r>
+            <w:r>
+              <w:t xml:space="preserve"> </w:t>
+            </w:r>
+            <w:r>
+              <w:t xml:space="preserve">for iLO Redfish check. Falls back to</w:t>
+            </w:r>
+            <w:r>
+              <w:t xml:space="preserve"> </w:t>
+            </w:r>
+            <w:r>
+              <w:rPr>
+                <w:rStyle w:val="VerbatimChar"/>
+              </w:rPr>
+              <w:t xml:space="preserve">-OneViewCredential</w:t>
+            </w:r>
+            <w:r>
+              <w:t xml:space="preserve"> </w:t>
+            </w:r>
+            <w:r>
+              <w:t xml:space="preserve">or the active</w:t>
+            </w:r>
+            <w:r>
+              <w:t xml:space="preserve"> </w:t>
+            </w:r>
+            <w:r>
+              <w:rPr>
+                <w:rStyle w:val="VerbatimChar"/>
+              </w:rPr>
+              <w:t xml:space="preserve">Connect-OneView</w:t>
+            </w:r>
+            <w:r>
+              <w:t xml:space="preserve"> </w:t>
+            </w:r>
+            <w:r>
+              <w:t xml:space="preserve">session credentials (appliance/iLO shared identity). Prompts interactively only when no explicit credential and no active OneView session are available.</w:t>
             </w:r>
           </w:p>
         </w:tc>
@@ -14544,7 +14583,7 @@
         <w:t xml:space="preserve"> </w:t>
       </w:r>
       <w:r>
-        <w:t xml:space="preserve">any destructive action (ISO mount, reboot) and removes it</w:t>
+        <w:t xml:space="preserve">any destructive action (ISO mount, reboot). This stops unnecessary alerting and avoids on-call callouts during deployment. If the server is</w:t>
       </w:r>
       <w:r>
         <w:t xml:space="preserve"> </w:t>
@@ -14554,13 +14593,13 @@
           <w:b/>
           <w:bCs/>
         </w:rPr>
-        <w:t xml:space="preserve">after</w:t>
-      </w:r>
-      <w:r>
-        <w:t xml:space="preserve"> </w:t>
-      </w:r>
-      <w:r>
-        <w:t xml:space="preserve">the build completes. This stops unnecessary alerting and avoids on-call callouts during deployment. If the server is</w:t>
+        <w:t xml:space="preserve">already</w:t>
+      </w:r>
+      <w:r>
+        <w:t xml:space="preserve"> </w:t>
+      </w:r>
+      <w:r>
+        <w:t xml:space="preserve">in maintenance mode (as reported by OneView), the enable step is skipped. Maintenance mode is</w:t>
       </w:r>
       <w:r>
         <w:t xml:space="preserve"> </w:t>
@@ -14570,13 +14609,28 @@
           <w:b/>
           <w:bCs/>
         </w:rPr>
-        <w:t xml:space="preserve">already</w:t>
-      </w:r>
-      <w:r>
-        <w:t xml:space="preserve"> </w:t>
-      </w:r>
-      <w:r>
-        <w:t xml:space="preserve">in maintenance mode (as reported by OneView), the enable step is skipped and the post-build disable still runs so the original state is restored. A highlighted notice appears in the deployment summary:</w:t>
+        <w:t xml:space="preserve">not</w:t>
+      </w:r>
+      <w:r>
+        <w:t xml:space="preserve"> </w:t>
+      </w:r>
+      <w:r>
+        <w:t xml:space="preserve">automatically removed after the build — the operator is responsible for managing the maintenance mode lifecycle via</w:t>
+      </w:r>
+      <w:r>
+        <w:t xml:space="preserve"> </w:t>
+      </w:r>
+      <w:r>
+        <w:rPr>
+          <w:rStyle w:val="VerbatimChar"/>
+        </w:rPr>
+        <w:t xml:space="preserve">Disable-OneViewMaintenanceMode</w:t>
+      </w:r>
+      <w:r>
+        <w:t xml:space="preserve"> </w:t>
+      </w:r>
+      <w:r>
+        <w:t xml:space="preserve">when the deployment is complete. A highlighted notice appears in the deployment summary:</w:t>
       </w:r>
     </w:p>
     <w:p>
@@ -14650,7 +14704,7 @@
         <w:rPr>
           <w:rStyle w:val="VerbatimChar"/>
         </w:rPr>
-        <w:t xml:space="preserve">&gt; ║  Maintenance mode will be automatically removed when the             ║</w:t>
+        <w:t xml:space="preserve">&gt; ║  Maintenance mode is NOT automatically removed after the build.      ║</w:t>
       </w:r>
       <w:r>
         <w:br/>
@@ -14659,7 +14713,7 @@
         <w:rPr>
           <w:rStyle w:val="VerbatimChar"/>
         </w:rPr>
-        <w:t xml:space="preserve">&gt; ║  build completes (or if it fails).                                   ║</w:t>
+        <w:t xml:space="preserve">&gt; ║  Disable it manually when the server is stable:                      ║</w:t>
       </w:r>
       <w:r>
         <w:br/>
@@ -14668,6 +14722,15 @@
         <w:rPr>
           <w:rStyle w:val="VerbatimChar"/>
         </w:rPr>
+        <w:t xml:space="preserve">&gt; ║  Disable-OneViewMaintenanceMode -TargetId &lt;server&gt; -Environment Prod ║</w:t>
+      </w:r>
+      <w:r>
+        <w:br/>
+      </w:r>
+      <w:r>
+        <w:rPr>
+          <w:rStyle w:val="VerbatimChar"/>
+        </w:rPr>
         <w:t xml:space="preserve">&gt; ║                                                                      ║</w:t>
       </w:r>
       <w:r>
@@ -14677,7 +14740,7 @@
         <w:rPr>
           <w:rStyle w:val="VerbatimChar"/>
         </w:rPr>
-        <w:t xml:space="preserve">&gt; ║  To skip this, use -NoMaintenanceMode.                               ║</w:t>
+        <w:t xml:space="preserve">&gt; ║  To skip the enable step entirely, use -NoMaintenanceMode.           ║</w:t>
       </w:r>
       <w:r>
         <w:br/>
@@ -14688,101 +14751,295 @@
         </w:rPr>
         <w:t xml:space="preserve">&gt; ╚══════════════════════════════════════════════════════════════════════╝</w:t>
       </w:r>
+    </w:p>
+    <w:p>
+      <w:pPr>
+        <w:pStyle w:val="BlockText"/>
+      </w:pPr>
+      <w:r>
+        <w:t xml:space="preserve">Use</w:t>
+      </w:r>
+      <w:r>
+        <w:t xml:space="preserve"> </w:t>
+      </w:r>
+      <w:r>
+        <w:rPr>
+          <w:rStyle w:val="VerbatimChar"/>
+        </w:rPr>
+        <w:t xml:space="preserve">-NoMaintenanceMode</w:t>
+      </w:r>
+      <w:r>
+        <w:t xml:space="preserve"> </w:t>
+      </w:r>
+      <w:r>
+        <w:t xml:space="preserve">(or</w:t>
+      </w:r>
+      <w:r>
+        <w:t xml:space="preserve"> </w:t>
+      </w:r>
+      <w:r>
+        <w:rPr>
+          <w:rStyle w:val="VerbatimChar"/>
+        </w:rPr>
+        <w:t xml:space="preserve">-OneViewMaintenanceMode:$false</w:t>
+      </w:r>
+      <w:r>
+        <w:t xml:space="preserve">) to disable the automatic enable step when OneView is unavailable or the server is not managed by OneView. Maintenance mode disable is always a manual operator action.</w:t>
+      </w:r>
+    </w:p>
+    <w:p>
+      <w:r>
+        <w:pict>
+          <v:rect style="width:0;height:1.5pt" o:hralign="center" o:hrstd="t" o:hr="t"/>
+        </w:pict>
+      </w:r>
+    </w:p>
+    <w:bookmarkEnd w:id="28"/>
+    <w:bookmarkStart w:id="29" w:name="sec54"/>
+    <w:p>
+      <w:pPr>
+        <w:pStyle w:val="Heading3"/>
+      </w:pPr>
+      <w:r>
+        <w:t xml:space="preserve">Full build (most common)</w:t>
+      </w:r>
+    </w:p>
+    <w:p>
+      <w:pPr>
+        <w:pStyle w:val="FirstParagraph"/>
+      </w:pPr>
+      <w:r>
+        <w:rPr>
+          <w:rStyle w:val="VerbatimChar"/>
+        </w:rPr>
+        <w:t xml:space="preserve">Configure-PhysicalBuild</w:t>
+      </w:r>
+      <w:r>
+        <w:t xml:space="preserve"> </w:t>
+      </w:r>
+      <w:r>
+        <w:t xml:space="preserve">is the only build command you run from the terminal. It performs the full 4-eye review internally and, on authorization (typing</w:t>
+      </w:r>
+      <w:r>
+        <w:t xml:space="preserve"> </w:t>
+      </w:r>
+      <w:r>
+        <w:rPr>
+          <w:rStyle w:val="VerbatimChar"/>
+        </w:rPr>
+        <w:t xml:space="preserve">APPROVE</w:t>
+      </w:r>
+      <w:r>
+        <w:t xml:space="preserve"> </w:t>
+      </w:r>
+      <w:r>
+        <w:t xml:space="preserve">or passing</w:t>
+      </w:r>
+      <w:r>
+        <w:t xml:space="preserve"> </w:t>
+      </w:r>
+      <w:r>
+        <w:rPr>
+          <w:rStyle w:val="VerbatimChar"/>
+        </w:rPr>
+        <w:t xml:space="preserve">-Deploy</w:t>
+      </w:r>
+      <w:r>
+        <w:t xml:space="preserve">/</w:t>
+      </w:r>
+      <w:r>
+        <w:rPr>
+          <w:rStyle w:val="VerbatimChar"/>
+        </w:rPr>
+        <w:t xml:space="preserve">-Execute</w:t>
+      </w:r>
+      <w:r>
+        <w:t xml:space="preserve">), executes the build pipeline internally. There is no separate command to call directly.</w:t>
+      </w:r>
+    </w:p>
+    <w:p>
+      <w:pPr>
+        <w:pStyle w:val="SourceCode"/>
+      </w:pPr>
+      <w:r>
+        <w:rPr>
+          <w:rStyle w:val="CommentTok"/>
+        </w:rPr>
+        <w:t xml:space="preserve"># Review + deploy in one command (recommended) {#sec55}</w:t>
+      </w:r>
       <w:r>
         <w:br/>
       </w:r>
       <w:r>
         <w:rPr>
-          <w:rStyle w:val="VerbatimChar"/>
-        </w:rPr>
-        <w:t xml:space="preserve">&gt; ```</w:t>
+          <w:rStyle w:val="NormalTok"/>
+        </w:rPr>
+        <w:t xml:space="preserve">Configure-PhysicalBuild </w:t>
+      </w:r>
+      <w:r>
+        <w:rPr>
+          <w:rStyle w:val="OperatorTok"/>
+        </w:rPr>
+        <w:t xml:space="preserve">-</w:t>
+      </w:r>
+      <w:r>
+        <w:rPr>
+          <w:rStyle w:val="NormalTok"/>
+        </w:rPr>
+        <w:t xml:space="preserve">ServerIdentifier srv01 </w:t>
+      </w:r>
+      <w:r>
+        <w:rPr>
+          <w:rStyle w:val="OperatorTok"/>
+        </w:rPr>
+        <w:t xml:space="preserve">-</w:t>
+      </w:r>
+      <w:r>
+        <w:rPr>
+          <w:rStyle w:val="NormalTok"/>
+        </w:rPr>
+        <w:t xml:space="preserve">OneViewHost oneview</w:t>
+      </w:r>
+      <w:r>
+        <w:rPr>
+          <w:rStyle w:val="OperatorTok"/>
+        </w:rPr>
+        <w:t xml:space="preserve">.</w:t>
+      </w:r>
+      <w:r>
+        <w:rPr>
+          <w:rStyle w:val="FunctionTok"/>
+        </w:rPr>
+        <w:t xml:space="preserve">corp</w:t>
+      </w:r>
+      <w:r>
+        <w:rPr>
+          <w:rStyle w:val="OperatorTok"/>
+        </w:rPr>
+        <w:t xml:space="preserve">.</w:t>
+      </w:r>
+      <w:r>
+        <w:rPr>
+          <w:rStyle w:val="FunctionTok"/>
+        </w:rPr>
+        <w:t xml:space="preserve">local</w:t>
+      </w:r>
+      <w:r>
+        <w:rPr>
+          <w:rStyle w:val="NormalTok"/>
+        </w:rPr>
+        <w:t xml:space="preserve"> </w:t>
+      </w:r>
+      <w:r>
+        <w:rPr>
+          <w:rStyle w:val="OperatorTok"/>
+        </w:rPr>
+        <w:t xml:space="preserve">-</w:t>
+      </w:r>
+      <w:r>
+        <w:rPr>
+          <w:rStyle w:val="NormalTok"/>
+        </w:rPr>
+        <w:t xml:space="preserve">IloIp </w:t>
+      </w:r>
+      <w:r>
+        <w:rPr>
+          <w:rStyle w:val="DecValTok"/>
+        </w:rPr>
+        <w:t xml:space="preserve">10.0</w:t>
+      </w:r>
+      <w:r>
+        <w:rPr>
+          <w:rStyle w:val="OperatorTok"/>
+        </w:rPr>
+        <w:t xml:space="preserve">.</w:t>
+      </w:r>
+      <w:r>
+        <w:rPr>
+          <w:rStyle w:val="DecValTok"/>
+        </w:rPr>
+        <w:t xml:space="preserve">1.50</w:t>
+      </w:r>
+      <w:r>
+        <w:rPr>
+          <w:rStyle w:val="NormalTok"/>
+        </w:rPr>
+        <w:t xml:space="preserve"> `</w:t>
       </w:r>
       <w:r>
         <w:br/>
       </w:r>
       <w:r>
         <w:rPr>
-          <w:rStyle w:val="VerbatimChar"/>
-        </w:rPr>
-        <w:t xml:space="preserve">&gt; Use `-NoMaintenanceMode` (or `-OneViewMaintenanceMode:$false`) to disable this behavior when OneView is unavailable or the server is not managed by OneView.</w:t>
-      </w:r>
-      <w:r>
-        <w:br/>
-      </w:r>
-      <w:r>
-        <w:br/>
-      </w:r>
-      <w:r>
-        <w:rPr>
-          <w:rStyle w:val="VerbatimChar"/>
-        </w:rPr>
-        <w:t xml:space="preserve">---</w:t>
-      </w:r>
-      <w:r>
-        <w:br/>
-      </w:r>
-      <w:r>
-        <w:br/>
-      </w:r>
-      <w:r>
-        <w:br/>
-      </w:r>
-      <w:r>
-        <w:rPr>
-          <w:rStyle w:val="VerbatimChar"/>
-        </w:rPr>
-        <w:t xml:space="preserve">### Full build (most common) {#sec54}</w:t>
-      </w:r>
-      <w:r>
-        <w:br/>
-      </w:r>
-      <w:r>
-        <w:br/>
-      </w:r>
-      <w:r>
-        <w:rPr>
-          <w:rStyle w:val="VerbatimChar"/>
-        </w:rPr>
-        <w:t xml:space="preserve">`Configure-PhysicalBuild` is the only build command you run from the terminal. It performs the full 4-eye review internally and, on authorization (typing `APPROVE` or passing `-Deploy`/`-Execute`), executes the build pipeline internally. There is no separate command to call directly.</w:t>
-      </w:r>
-      <w:r>
-        <w:br/>
-      </w:r>
-      <w:r>
-        <w:br/>
-      </w:r>
-      <w:r>
-        <w:rPr>
-          <w:rStyle w:val="VerbatimChar"/>
-        </w:rPr>
-        <w:t xml:space="preserve">```powershell</w:t>
-      </w:r>
-      <w:r>
-        <w:br/>
-      </w:r>
-      <w:r>
-        <w:rPr>
-          <w:rStyle w:val="VerbatimChar"/>
-        </w:rPr>
-        <w:t xml:space="preserve"># Review + deploy in one command (recommended) {#sec55}</w:t>
-      </w:r>
-      <w:r>
-        <w:br/>
-      </w:r>
-      <w:r>
-        <w:rPr>
-          <w:rStyle w:val="VerbatimChar"/>
-        </w:rPr>
-        <w:t xml:space="preserve">Configure-PhysicalBuild -ServerIdentifier srv01 -OneViewHost oneview.corp.local -IloIp 10.0.1.50 `</w:t>
-      </w:r>
-      <w:r>
-        <w:br/>
-      </w:r>
-      <w:r>
-        <w:rPr>
-          <w:rStyle w:val="VerbatimChar"/>
-        </w:rPr>
-        <w:t xml:space="preserve">    -ExternalIsoPath '\\fileserver\isos\WinSrv2025.iso' -InMaintenanceWindow -Deploy -GuardRail 'srv01'</w:t>
+          <w:rStyle w:val="NormalTok"/>
+        </w:rPr>
+        <w:t xml:space="preserve">    </w:t>
+      </w:r>
+      <w:r>
+        <w:rPr>
+          <w:rStyle w:val="OperatorTok"/>
+        </w:rPr>
+        <w:t xml:space="preserve">-</w:t>
+      </w:r>
+      <w:r>
+        <w:rPr>
+          <w:rStyle w:val="NormalTok"/>
+        </w:rPr>
+        <w:t xml:space="preserve">ExternalIsoPath </w:t>
+      </w:r>
+      <w:r>
+        <w:rPr>
+          <w:rStyle w:val="StringTok"/>
+        </w:rPr>
+        <w:t xml:space="preserve">'\\fileserver\isos\WinSrv2025.iso'</w:t>
+      </w:r>
+      <w:r>
+        <w:rPr>
+          <w:rStyle w:val="NormalTok"/>
+        </w:rPr>
+        <w:t xml:space="preserve"> </w:t>
+      </w:r>
+      <w:r>
+        <w:rPr>
+          <w:rStyle w:val="OperatorTok"/>
+        </w:rPr>
+        <w:t xml:space="preserve">-</w:t>
+      </w:r>
+      <w:r>
+        <w:rPr>
+          <w:rStyle w:val="NormalTok"/>
+        </w:rPr>
+        <w:t xml:space="preserve">InMaintenanceWindow </w:t>
+      </w:r>
+      <w:r>
+        <w:rPr>
+          <w:rStyle w:val="OperatorTok"/>
+        </w:rPr>
+        <w:t xml:space="preserve">-</w:t>
+      </w:r>
+      <w:r>
+        <w:rPr>
+          <w:rStyle w:val="NormalTok"/>
+        </w:rPr>
+        <w:t xml:space="preserve">Deploy </w:t>
+      </w:r>
+      <w:r>
+        <w:rPr>
+          <w:rStyle w:val="OperatorTok"/>
+        </w:rPr>
+        <w:t xml:space="preserve">-</w:t>
+      </w:r>
+      <w:r>
+        <w:rPr>
+          <w:rStyle w:val="NormalTok"/>
+        </w:rPr>
+        <w:t xml:space="preserve">GuardRail </w:t>
+      </w:r>
+      <w:r>
+        <w:rPr>
+          <w:rStyle w:val="StringTok"/>
+        </w:rPr>
+        <w:t xml:space="preserve">'srv01'</w:t>
       </w:r>
     </w:p>
     <w:p>
@@ -14809,7 +15066,38 @@
         <w:t xml:space="preserve"> </w:t>
       </w:r>
       <w:r>
-        <w:t xml:space="preserve">automatically places the server into HPE OneView maintenance mode before destructive operations and removes it after the build completes. Use</w:t>
+        <w:t xml:space="preserve">automatically places the server into HPE OneView maintenance mode before destructive operations. Maintenance mode is</w:t>
+      </w:r>
+      <w:r>
+        <w:t xml:space="preserve"> </w:t>
+      </w:r>
+      <w:r>
+        <w:rPr>
+          <w:b/>
+          <w:bCs/>
+        </w:rPr>
+        <w:t xml:space="preserve">not</w:t>
+      </w:r>
+      <w:r>
+        <w:t xml:space="preserve"> </w:t>
+      </w:r>
+      <w:r>
+        <w:t xml:space="preserve">automatically removed after the build completes — the operator is responsible for disabling it via</w:t>
+      </w:r>
+      <w:r>
+        <w:t xml:space="preserve"> </w:t>
+      </w:r>
+      <w:r>
+        <w:rPr>
+          <w:rStyle w:val="VerbatimChar"/>
+        </w:rPr>
+        <w:t xml:space="preserve">Disable-OneViewMaintenanceMode</w:t>
+      </w:r>
+      <w:r>
+        <w:t xml:space="preserve"> </w:t>
+      </w:r>
+      <w:r>
+        <w:t xml:space="preserve">when the server is stable. Use</w:t>
       </w:r>
       <w:r>
         <w:t xml:space="preserve"> </w:t>
@@ -14824,11 +15112,11 @@
         <w:t xml:space="preserve"> </w:t>
       </w:r>
       <w:r>
-        <w:t xml:space="preserve">to skip this behavior.</w:t>
-      </w:r>
-    </w:p>
-    <w:bookmarkEnd w:id="28"/>
-    <w:bookmarkStart w:id="32" w:name="sec56"/>
+        <w:t xml:space="preserve">to skip the enable step entirely.</w:t>
+      </w:r>
+    </w:p>
+    <w:bookmarkEnd w:id="29"/>
+    <w:bookmarkStart w:id="33" w:name="sec56"/>
     <w:p>
       <w:pPr>
         <w:pStyle w:val="Heading3"/>
@@ -14980,7 +15268,7 @@
         <w:t xml:space="preserve">via HPE SUT/SUM.</w:t>
       </w:r>
     </w:p>
-    <w:bookmarkStart w:id="29" w:name="sec57"/>
+    <w:bookmarkStart w:id="30" w:name="sec57"/>
     <w:p>
       <w:pPr>
         <w:pStyle w:val="Heading4"/>
@@ -16192,8 +16480,8 @@
         <w:t xml:space="preserve">disk) is rejected — the iLO BMC is a separate controller and cannot read local drives on the automation host.</w:t>
       </w:r>
     </w:p>
-    <w:bookmarkEnd w:id="29"/>
-    <w:bookmarkStart w:id="30" w:name="sec62"/>
+    <w:bookmarkEnd w:id="30"/>
+    <w:bookmarkStart w:id="31" w:name="sec62"/>
     <w:p>
       <w:pPr>
         <w:pStyle w:val="Heading4"/>
@@ -17478,8 +17766,8 @@
         <w:t xml:space="preserve">(not silently skipped).</w:t>
       </w:r>
     </w:p>
-    <w:bookmarkEnd w:id="30"/>
-    <w:bookmarkStart w:id="31" w:name="sec67"/>
+    <w:bookmarkEnd w:id="31"/>
+    <w:bookmarkStart w:id="32" w:name="sec67"/>
     <w:p>
       <w:pPr>
         <w:pStyle w:val="Heading4"/>
@@ -17828,9 +18116,9 @@
         <w:t xml:space="preserve">'srv01'</w:t>
       </w:r>
     </w:p>
-    <w:bookmarkEnd w:id="31"/>
     <w:bookmarkEnd w:id="32"/>
-    <w:bookmarkStart w:id="33" w:name="sec68"/>
+    <w:bookmarkEnd w:id="33"/>
+    <w:bookmarkStart w:id="34" w:name="sec68"/>
     <w:p>
       <w:pPr>
         <w:pStyle w:val="Heading3"/>
@@ -18003,8 +18291,8 @@
         <w:t xml:space="preserve">'srv01'</w:t>
       </w:r>
     </w:p>
-    <w:bookmarkEnd w:id="33"/>
-    <w:bookmarkStart w:id="34" w:name="sec69"/>
+    <w:bookmarkEnd w:id="34"/>
+    <w:bookmarkStart w:id="35" w:name="sec69"/>
     <w:p>
       <w:pPr>
         <w:pStyle w:val="Heading3"/>
@@ -18102,8 +18390,8 @@
         <w:t xml:space="preserve">'srv01'</w:t>
       </w:r>
     </w:p>
-    <w:bookmarkEnd w:id="34"/>
-    <w:bookmarkStart w:id="35" w:name="sec70"/>
+    <w:bookmarkEnd w:id="35"/>
+    <w:bookmarkStart w:id="36" w:name="sec70"/>
     <w:p>
       <w:pPr>
         <w:pStyle w:val="Heading3"/>
@@ -18376,9 +18664,9 @@
         </w:pict>
       </w:r>
     </w:p>
-    <w:bookmarkEnd w:id="35"/>
     <w:bookmarkEnd w:id="36"/>
-    <w:bookmarkStart w:id="57" w:name="sec71"/>
+    <w:bookmarkEnd w:id="37"/>
+    <w:bookmarkStart w:id="58" w:name="sec71"/>
     <w:p>
       <w:pPr>
         <w:pStyle w:val="Heading2"/>
@@ -18395,7 +18683,7 @@
         <w:t xml:space="preserve">Commands for deploying ISOs to servers and monitoring installation progress.</w:t>
       </w:r>
     </w:p>
-    <w:bookmarkStart w:id="39" w:name="sec72"/>
+    <w:bookmarkStart w:id="40" w:name="sec72"/>
     <w:p>
       <w:pPr>
         <w:pStyle w:val="Heading3"/>
@@ -18507,7 +18795,7 @@
         <w:t xml:space="preserve">Server srv01</w:t>
       </w:r>
     </w:p>
-    <w:bookmarkStart w:id="37" w:name="sec73"/>
+    <w:bookmarkStart w:id="38" w:name="sec73"/>
     <w:p>
       <w:pPr>
         <w:pStyle w:val="Heading4"/>
@@ -18581,8 +18869,8 @@
         <w:t xml:space="preserve">15</w:t>
       </w:r>
     </w:p>
-    <w:bookmarkEnd w:id="37"/>
-    <w:bookmarkStart w:id="38" w:name="sec74"/>
+    <w:bookmarkEnd w:id="38"/>
+    <w:bookmarkStart w:id="39" w:name="sec74"/>
     <w:p>
       <w:pPr>
         <w:pStyle w:val="Heading4"/>
@@ -19339,9 +19627,9 @@
         </w:pict>
       </w:r>
     </w:p>
-    <w:bookmarkEnd w:id="38"/>
     <w:bookmarkEnd w:id="39"/>
-    <w:bookmarkStart w:id="44" w:name="sec76"/>
+    <w:bookmarkEnd w:id="40"/>
+    <w:bookmarkStart w:id="45" w:name="sec76"/>
     <w:p>
       <w:pPr>
         <w:pStyle w:val="Heading3"/>
@@ -19707,7 +19995,7 @@
         <w:t xml:space="preserve">Force</w:t>
       </w:r>
     </w:p>
-    <w:bookmarkStart w:id="40" w:name="sec77"/>
+    <w:bookmarkStart w:id="41" w:name="sec77"/>
     <w:p>
       <w:pPr>
         <w:pStyle w:val="Heading4"/>
@@ -19805,8 +20093,8 @@
         <w:t xml:space="preserve">'https://artifacts/isos/WinSrv2025_v1.0.iso'</w:t>
       </w:r>
     </w:p>
-    <w:bookmarkEnd w:id="40"/>
-    <w:bookmarkStart w:id="41" w:name="sec78"/>
+    <w:bookmarkEnd w:id="41"/>
+    <w:bookmarkStart w:id="42" w:name="sec78"/>
     <w:p>
       <w:pPr>
         <w:pStyle w:val="Heading4"/>
@@ -19868,8 +20156,8 @@
         <w:t xml:space="preserve">1.50</w:t>
       </w:r>
     </w:p>
-    <w:bookmarkEnd w:id="41"/>
-    <w:bookmarkStart w:id="42" w:name="sec79"/>
+    <w:bookmarkEnd w:id="42"/>
+    <w:bookmarkStart w:id="43" w:name="sec79"/>
     <w:p>
       <w:pPr>
         <w:pStyle w:val="Heading4"/>
@@ -19931,8 +20219,8 @@
         <w:t xml:space="preserve">1.50</w:t>
       </w:r>
     </w:p>
-    <w:bookmarkEnd w:id="42"/>
-    <w:bookmarkStart w:id="43" w:name="sec80"/>
+    <w:bookmarkEnd w:id="43"/>
+    <w:bookmarkStart w:id="44" w:name="sec80"/>
     <w:p>
       <w:pPr>
         <w:pStyle w:val="Heading4"/>
@@ -21112,9 +21400,9 @@
         </w:pict>
       </w:r>
     </w:p>
-    <w:bookmarkEnd w:id="43"/>
     <w:bookmarkEnd w:id="44"/>
-    <w:bookmarkStart w:id="47" w:name="sec83"/>
+    <w:bookmarkEnd w:id="45"/>
+    <w:bookmarkStart w:id="48" w:name="sec83"/>
     <w:p>
       <w:pPr>
         <w:pStyle w:val="Heading3"/>
@@ -21498,7 +21786,7 @@
         <w:t xml:space="preserve">local</w:t>
       </w:r>
     </w:p>
-    <w:bookmarkStart w:id="45" w:name="sec84"/>
+    <w:bookmarkStart w:id="46" w:name="sec84"/>
     <w:p>
       <w:pPr>
         <w:pStyle w:val="Heading4"/>
@@ -21584,8 +21872,8 @@
         <w:t xml:space="preserve">IdentifierType Serial</w:t>
       </w:r>
     </w:p>
-    <w:bookmarkEnd w:id="45"/>
-    <w:bookmarkStart w:id="46" w:name="sec85"/>
+    <w:bookmarkEnd w:id="46"/>
+    <w:bookmarkStart w:id="47" w:name="sec85"/>
     <w:p>
       <w:pPr>
         <w:pStyle w:val="Heading4"/>
@@ -22658,9 +22946,9 @@
         </w:pict>
       </w:r>
     </w:p>
-    <w:bookmarkEnd w:id="46"/>
     <w:bookmarkEnd w:id="47"/>
-    <w:bookmarkStart w:id="50" w:name="sec86"/>
+    <w:bookmarkEnd w:id="48"/>
+    <w:bookmarkStart w:id="51" w:name="sec86"/>
     <w:p>
       <w:pPr>
         <w:pStyle w:val="Heading3"/>
@@ -22956,7 +23244,7 @@
         <w:t xml:space="preserve">1.50</w:t>
       </w:r>
     </w:p>
-    <w:bookmarkStart w:id="48" w:name="sec87"/>
+    <w:bookmarkStart w:id="49" w:name="sec87"/>
     <w:p>
       <w:pPr>
         <w:pStyle w:val="Heading4"/>
@@ -23012,8 +23300,8 @@
         <w:t xml:space="preserve">SkipIsoUrl</w:t>
       </w:r>
     </w:p>
-    <w:bookmarkEnd w:id="48"/>
-    <w:bookmarkStart w:id="49" w:name="sec88"/>
+    <w:bookmarkEnd w:id="49"/>
+    <w:bookmarkStart w:id="50" w:name="sec88"/>
     <w:p>
       <w:pPr>
         <w:pStyle w:val="Heading4"/>
@@ -24053,9 +24341,9 @@
         </w:pict>
       </w:r>
     </w:p>
-    <w:bookmarkEnd w:id="49"/>
     <w:bookmarkEnd w:id="50"/>
-    <w:bookmarkStart w:id="53" w:name="sec89"/>
+    <w:bookmarkEnd w:id="51"/>
+    <w:bookmarkStart w:id="54" w:name="sec89"/>
     <w:p>
       <w:pPr>
         <w:pStyle w:val="Heading3"/>
@@ -24111,7 +24399,7 @@
         <w:t xml:space="preserve">local</w:t>
       </w:r>
     </w:p>
-    <w:bookmarkStart w:id="51" w:name="sec90"/>
+    <w:bookmarkStart w:id="52" w:name="sec90"/>
     <w:p>
       <w:pPr>
         <w:pStyle w:val="Heading4"/>
@@ -24155,8 +24443,8 @@
         <w:t xml:space="preserve">SkipCmClient</w:t>
       </w:r>
     </w:p>
-    <w:bookmarkEnd w:id="51"/>
-    <w:bookmarkStart w:id="52" w:name="sec91"/>
+    <w:bookmarkEnd w:id="52"/>
+    <w:bookmarkStart w:id="53" w:name="sec91"/>
     <w:p>
       <w:pPr>
         <w:pStyle w:val="Heading4"/>
@@ -25178,9 +25466,9 @@
         </w:pict>
       </w:r>
     </w:p>
-    <w:bookmarkEnd w:id="52"/>
     <w:bookmarkEnd w:id="53"/>
-    <w:bookmarkStart w:id="56" w:name="sec93"/>
+    <w:bookmarkEnd w:id="54"/>
+    <w:bookmarkStart w:id="57" w:name="sec93"/>
     <w:p>
       <w:pPr>
         <w:pStyle w:val="Heading3"/>
@@ -25377,7 +25665,7 @@
         <w:t xml:space="preserve">Server srv01</w:t>
       </w:r>
     </w:p>
-    <w:bookmarkStart w:id="54" w:name="sec94"/>
+    <w:bookmarkStart w:id="55" w:name="sec94"/>
     <w:p>
       <w:pPr>
         <w:pStyle w:val="Heading4"/>
@@ -25445,8 +25733,8 @@
         <w:t xml:space="preserve">Method powershell</w:t>
       </w:r>
     </w:p>
-    <w:bookmarkEnd w:id="54"/>
-    <w:bookmarkStart w:id="55" w:name="sec95"/>
+    <w:bookmarkEnd w:id="55"/>
+    <w:bookmarkStart w:id="56" w:name="sec95"/>
     <w:p>
       <w:pPr>
         <w:pStyle w:val="Heading4"/>
@@ -26347,10 +26635,10 @@
         </w:pict>
       </w:r>
     </w:p>
-    <w:bookmarkEnd w:id="55"/>
     <w:bookmarkEnd w:id="56"/>
     <w:bookmarkEnd w:id="57"/>
-    <w:bookmarkStart w:id="63" w:name="sec97"/>
+    <w:bookmarkEnd w:id="58"/>
+    <w:bookmarkStart w:id="64" w:name="sec97"/>
     <w:p>
       <w:pPr>
         <w:pStyle w:val="Heading2"/>
@@ -26369,7 +26657,7 @@
       <w:r>
         <w:t xml:space="preserve"> </w:t>
       </w:r>
-      <w:hyperlink r:id="rId58">
+      <w:hyperlink r:id="rId59">
         <w:r>
           <w:rPr>
             <w:rStyle w:val="VerbatimChar"/>
@@ -26384,7 +26672,7 @@
         <w:t xml:space="preserve">for the full guide.</w:t>
       </w:r>
     </w:p>
-    <w:bookmarkStart w:id="59" w:name="sec98"/>
+    <w:bookmarkStart w:id="60" w:name="sec98"/>
     <w:p>
       <w:pPr>
         <w:pStyle w:val="Heading3"/>
@@ -26459,8 +26747,8 @@
         </w:pict>
       </w:r>
     </w:p>
-    <w:bookmarkEnd w:id="59"/>
-    <w:bookmarkStart w:id="61" w:name="sec99"/>
+    <w:bookmarkEnd w:id="60"/>
+    <w:bookmarkStart w:id="62" w:name="sec99"/>
     <w:p>
       <w:pPr>
         <w:pStyle w:val="Heading3"/>
@@ -28195,7 +28483,7 @@
       <w:r>
         <w:t xml:space="preserve"> </w:t>
       </w:r>
-      <w:hyperlink r:id="rId60">
+      <w:hyperlink r:id="rId61">
         <w:r>
           <w:rPr>
             <w:rStyle w:val="VerbatimChar"/>
@@ -28211,8 +28499,8 @@
         </w:pict>
       </w:r>
     </w:p>
-    <w:bookmarkEnd w:id="61"/>
-    <w:bookmarkStart w:id="62" w:name="sec104"/>
+    <w:bookmarkEnd w:id="62"/>
+    <w:bookmarkStart w:id="63" w:name="sec104"/>
     <w:p>
       <w:pPr>
         <w:pStyle w:val="Heading3"/>
@@ -29710,7 +29998,7 @@
       <w:r>
         <w:t xml:space="preserve"> </w:t>
       </w:r>
-      <w:hyperlink r:id="rId60">
+      <w:hyperlink r:id="rId61">
         <w:r>
           <w:rPr>
             <w:rStyle w:val="VerbatimChar"/>
@@ -29726,9 +30014,9 @@
         </w:pict>
       </w:r>
     </w:p>
-    <w:bookmarkEnd w:id="62"/>
     <w:bookmarkEnd w:id="63"/>
-    <w:bookmarkStart w:id="68" w:name="sec108"/>
+    <w:bookmarkEnd w:id="64"/>
+    <w:bookmarkStart w:id="69" w:name="sec108"/>
     <w:p>
       <w:pPr>
         <w:pStyle w:val="Heading2"/>
@@ -29745,7 +30033,7 @@
         <w:t xml:space="preserve">Low-level helpers used by other commands.</w:t>
       </w:r>
     </w:p>
-    <w:bookmarkStart w:id="64" w:name="sec109"/>
+    <w:bookmarkStart w:id="65" w:name="sec109"/>
     <w:p>
       <w:pPr>
         <w:pStyle w:val="Heading3"/>
@@ -30002,8 +30290,8 @@
         <w:t xml:space="preserve">30</w:t>
       </w:r>
     </w:p>
-    <w:bookmarkEnd w:id="64"/>
-    <w:bookmarkStart w:id="65" w:name="sec110"/>
+    <w:bookmarkEnd w:id="65"/>
+    <w:bookmarkStart w:id="66" w:name="sec110"/>
     <w:p>
       <w:pPr>
         <w:pStyle w:val="Heading3"/>
@@ -30059,8 +30347,8 @@
         <w:t xml:space="preserve">Server srv01</w:t>
       </w:r>
     </w:p>
-    <w:bookmarkEnd w:id="65"/>
-    <w:bookmarkStart w:id="66" w:name="sec111"/>
+    <w:bookmarkEnd w:id="66"/>
+    <w:bookmarkStart w:id="67" w:name="sec111"/>
     <w:p>
       <w:pPr>
         <w:pStyle w:val="Heading3"/>
@@ -30092,8 +30380,8 @@
         <w:t xml:space="preserve">ServerName srv01</w:t>
       </w:r>
     </w:p>
-    <w:bookmarkEnd w:id="66"/>
-    <w:bookmarkStart w:id="67" w:name="sec112"/>
+    <w:bookmarkEnd w:id="67"/>
+    <w:bookmarkStart w:id="68" w:name="sec112"/>
     <w:p>
       <w:pPr>
         <w:pStyle w:val="Heading3"/>
@@ -30265,9 +30553,9 @@
         </w:pict>
       </w:r>
     </w:p>
-    <w:bookmarkEnd w:id="67"/>
     <w:bookmarkEnd w:id="68"/>
-    <w:bookmarkStart w:id="73" w:name="sec113"/>
+    <w:bookmarkEnd w:id="69"/>
+    <w:bookmarkStart w:id="74" w:name="sec113"/>
     <w:p>
       <w:pPr>
         <w:pStyle w:val="Heading2"/>
@@ -30284,7 +30572,7 @@
         <w:t xml:space="preserve">Dispatch requests to the appropriate handler.</w:t>
       </w:r>
     </w:p>
-    <w:bookmarkStart w:id="69" w:name="sec114"/>
+    <w:bookmarkStart w:id="70" w:name="sec114"/>
     <w:p>
       <w:pPr>
         <w:pStyle w:val="Heading3"/>
@@ -30400,8 +30688,8 @@
         <w:t xml:space="preserve">}</w:t>
       </w:r>
     </w:p>
-    <w:bookmarkEnd w:id="69"/>
-    <w:bookmarkStart w:id="70" w:name="sec115"/>
+    <w:bookmarkEnd w:id="70"/>
+    <w:bookmarkStart w:id="71" w:name="sec115"/>
     <w:p>
       <w:pPr>
         <w:pStyle w:val="Heading3"/>
@@ -30421,8 +30709,8 @@
         <w:t xml:space="preserve">Get-RouteMap</w:t>
       </w:r>
     </w:p>
-    <w:bookmarkEnd w:id="70"/>
-    <w:bookmarkStart w:id="71" w:name="sec116"/>
+    <w:bookmarkEnd w:id="71"/>
+    <w:bookmarkStart w:id="72" w:name="sec116"/>
     <w:p>
       <w:pPr>
         <w:pStyle w:val="Heading3"/>
@@ -30712,8 +31000,8 @@
         <w:t xml:space="preserve">}</w:t>
       </w:r>
     </w:p>
-    <w:bookmarkEnd w:id="71"/>
-    <w:bookmarkStart w:id="72" w:name="sec117"/>
+    <w:bookmarkEnd w:id="72"/>
+    <w:bookmarkStart w:id="73" w:name="sec117"/>
     <w:p>
       <w:pPr>
         <w:pStyle w:val="Heading3"/>
@@ -30734,9 +31022,9 @@
         </w:pict>
       </w:r>
     </w:p>
-    <w:bookmarkEnd w:id="72"/>
     <w:bookmarkEnd w:id="73"/>
-    <w:bookmarkStart w:id="78" w:name="sec118"/>
+    <w:bookmarkEnd w:id="74"/>
+    <w:bookmarkStart w:id="79" w:name="sec118"/>
     <w:p>
       <w:pPr>
         <w:pStyle w:val="Heading2"/>
@@ -30908,7 +31196,7 @@
       <w:r>
         <w:t xml:space="preserve"> </w:t>
       </w:r>
-      <w:hyperlink r:id="rId74">
+      <w:hyperlink r:id="rId75">
         <w:r>
           <w:rPr>
             <w:rStyle w:val="VerbatimChar"/>
@@ -30925,7 +31213,7 @@
       <w:r>
         <w:t xml:space="preserve"> </w:t>
       </w:r>
-      <w:hyperlink r:id="rId75">
+      <w:hyperlink r:id="rId76">
         <w:r>
           <w:rPr>
             <w:rStyle w:val="VerbatimChar"/>
@@ -30937,7 +31225,7 @@
         <w:t xml:space="preserve">.</w:t>
       </w:r>
     </w:p>
-    <w:bookmarkStart w:id="76" w:name="sec119"/>
+    <w:bookmarkStart w:id="77" w:name="sec119"/>
     <w:p>
       <w:pPr>
         <w:pStyle w:val="Heading3"/>
@@ -31210,8 +31498,8 @@
         <w:t xml:space="preserve">$cred</w:t>
       </w:r>
     </w:p>
-    <w:bookmarkEnd w:id="76"/>
-    <w:bookmarkStart w:id="77" w:name="sec120"/>
+    <w:bookmarkEnd w:id="77"/>
+    <w:bookmarkStart w:id="78" w:name="sec120"/>
     <w:p>
       <w:pPr>
         <w:pStyle w:val="Heading3"/>
@@ -31519,9 +31807,9 @@
         <w:t xml:space="preserve">'srv0'</w:t>
       </w:r>
     </w:p>
-    <w:bookmarkEnd w:id="77"/>
     <w:bookmarkEnd w:id="78"/>
-    <w:bookmarkStart w:id="85" w:name="sec121"/>
+    <w:bookmarkEnd w:id="79"/>
+    <w:bookmarkStart w:id="86" w:name="sec121"/>
     <w:p>
       <w:pPr>
         <w:pStyle w:val="Heading2"/>
@@ -31530,7 +31818,7 @@
         <w:t xml:space="preserve">Troubleshooting</w:t>
       </w:r>
     </w:p>
-    <w:bookmarkStart w:id="79" w:name="sec122"/>
+    <w:bookmarkStart w:id="80" w:name="sec122"/>
     <w:p>
       <w:pPr>
         <w:pStyle w:val="Heading3"/>
@@ -31589,8 +31877,8 @@
         <w:t xml:space="preserve">Module Automation</w:t>
       </w:r>
     </w:p>
-    <w:bookmarkEnd w:id="79"/>
-    <w:bookmarkStart w:id="80" w:name="sec123"/>
+    <w:bookmarkEnd w:id="80"/>
+    <w:bookmarkStart w:id="81" w:name="sec123"/>
     <w:p>
       <w:pPr>
         <w:pStyle w:val="Heading3"/>
@@ -31640,8 +31928,8 @@
         <w:t xml:space="preserve">ps1</w:t>
       </w:r>
     </w:p>
-    <w:bookmarkEnd w:id="80"/>
-    <w:bookmarkStart w:id="81" w:name="sec124"/>
+    <w:bookmarkEnd w:id="81"/>
+    <w:bookmarkStart w:id="82" w:name="sec124"/>
     <w:p>
       <w:pPr>
         <w:pStyle w:val="Heading3"/>
@@ -31667,8 +31955,8 @@
         <w:t xml:space="preserve"> Automation</w:t>
       </w:r>
     </w:p>
-    <w:bookmarkEnd w:id="81"/>
-    <w:bookmarkStart w:id="82" w:name="sec125"/>
+    <w:bookmarkEnd w:id="82"/>
+    <w:bookmarkStart w:id="83" w:name="sec125"/>
     <w:p>
       <w:pPr>
         <w:pStyle w:val="Heading3"/>
@@ -31916,8 +32204,8 @@
         <w:t xml:space="preserve">Force</w:t>
       </w:r>
     </w:p>
-    <w:bookmarkEnd w:id="82"/>
-    <w:bookmarkStart w:id="84" w:name="sec126"/>
+    <w:bookmarkEnd w:id="83"/>
+    <w:bookmarkStart w:id="85" w:name="sec126"/>
     <w:p>
       <w:pPr>
         <w:pStyle w:val="Heading3"/>
@@ -31930,7 +32218,7 @@
       <w:pPr>
         <w:pStyle w:val="FirstParagraph"/>
       </w:pPr>
-      <w:hyperlink r:id="rId83">
+      <w:hyperlink r:id="rId84">
         <w:r>
           <w:rPr>
             <w:rStyle w:val="Hyperlink"/>
@@ -31945,9 +32233,9 @@
         <w:t xml:space="preserve">with per-command detail pages.</w:t>
       </w:r>
     </w:p>
-    <w:bookmarkEnd w:id="84"/>
     <w:bookmarkEnd w:id="85"/>
     <w:bookmarkEnd w:id="86"/>
+    <w:bookmarkEnd w:id="87"/>
     <w:sectPr>
       <w:pgSz w:w="16838" w:h="11906" w:orient="landscape"/>
       <w:footnotePr>

</xml_diff>